<commit_message>
Design and changes made to the data used for forecasting
</commit_message>
<xml_diff>
--- a/FSFDSS_Situation_and_Forecast_Report_2026_Gu.docx
+++ b/FSFDSS_Situation_and_Forecast_Report_2026_Gu.docx
@@ -62,7 +62,7 @@
         <w:t xml:space="preserve">Generated On: </w:t>
       </w:r>
       <w:r>
-        <w:t>29 June 2026 17:35</w:t>
+        <w:t>07 July 2026 22:39</w:t>
       </w:r>
     </w:p>
     <w:p>
@@ -98,13 +98,13 @@
         <w:t>Gu 2026:</w:t>
         <w:br/>
         <w:br/>
-        <w:t>• Forecast Food Consumption Score (FCS): 54.32</w:t>
+        <w:t>• Forecast Food Consumption Score (FCS): 53.59</w:t>
         <w:br/>
         <w:br/>
-        <w:t>• Forecast Reduced Coping Strategy Index (rCSI): 8.67</w:t>
+        <w:t>• Forecast Reduced Coping Strategy Index (rCSI): 9.47</w:t>
         <w:br/>
         <w:br/>
-        <w:t>• Forecast Household Hunger Scale (HHS): 1.24</w:t>
+        <w:t>• Forecast Household Hunger Scale (HHS): 1.21</w:t>
         <w:br/>
         <w:br/>
         <w:t>Overall forecast risk is classified as:</w:t>
@@ -115,7 +115,7 @@
         <w:br/>
         <w:t>Model interpretation using SHAP values indicates that</w:t>
         <w:br/>
-        <w:t>climate drivers remain the dominant determinants of</w:t>
+        <w:t>market drivers remain the dominant determinants of</w:t>
         <w:br/>
         <w:t>forecast food security outcomes.</w:t>
         <w:br/>
@@ -142,7 +142,7 @@
         <w:t>Forecasting and Decision Support System (FSFDSS) on</w:t>
         <w:br/>
         <w:br/>
-        <w:t>29 June 2026 at 17:35.</w:t>
+        <w:t>07 July 2026 at 22:39.</w:t>
         <w:br/>
         <w:br/>
       </w:r>
@@ -283,17 +283,17 @@
         <w:br/>
         <w:t xml:space="preserve">    • Forecast Food Consumption Score (FCS):</w:t>
         <w:br/>
-        <w:t xml:space="preserve">      54.32</w:t>
+        <w:t xml:space="preserve">      53.59</w:t>
         <w:br/>
         <w:br/>
         <w:t xml:space="preserve">    • Forecast Reduced Coping Strategy Index (rCSI):</w:t>
         <w:br/>
-        <w:t xml:space="preserve">      8.67</w:t>
+        <w:t xml:space="preserve">      9.47</w:t>
         <w:br/>
         <w:br/>
         <w:t xml:space="preserve">    • Forecast Household Hunger Scale (HHS):</w:t>
         <w:br/>
-        <w:t xml:space="preserve">      1.24</w:t>
+        <w:t xml:space="preserve">      1.21</w:t>
         <w:br/>
         <w:br/>
         <w:t xml:space="preserve">    Overall National Risk Assessment</w:t>
@@ -353,7 +353,7 @@
           </w:tcPr>
           <w:p>
             <w:r>
-              <w:t>54.32</w:t>
+              <w:t>53.59</w:t>
             </w:r>
           </w:p>
         </w:tc>
@@ -375,7 +375,7 @@
           </w:tcPr>
           <w:p>
             <w:r>
-              <w:t>8.67</w:t>
+              <w:t>9.47</w:t>
             </w:r>
           </w:p>
         </w:tc>
@@ -397,7 +397,7 @@
           </w:tcPr>
           <w:p>
             <w:r>
-              <w:t>1.24</w:t>
+              <w:t>1.21</w:t>
             </w:r>
           </w:p>
         </w:tc>
@@ -439,7 +439,7 @@
         <w:br/>
         <w:t>Machine learning interpretation using SHAP values indicates that</w:t>
         <w:br/>
-        <w:t>climate conditions remain the most influential drivers</w:t>
+        <w:t>market conditions remain the most influential drivers</w:t>
         <w:br/>
         <w:t>of predicted food security outcomes across Somalia.</w:t>
         <w:br/>
@@ -519,7 +519,73 @@
           </w:tcPr>
           <w:p>
             <w:r>
-              <w:t>3.122</w:t>
+              <w:t>3.229</w:t>
+            </w:r>
+          </w:p>
+        </w:tc>
+      </w:tr>
+      <w:tr>
+        <w:tc>
+          <w:tcPr>
+            <w:tcW w:type="dxa" w:w="4320"/>
+          </w:tcPr>
+          <w:p>
+            <w:r>
+              <w:t>ndvi_lag1</w:t>
+            </w:r>
+          </w:p>
+        </w:tc>
+        <w:tc>
+          <w:tcPr>
+            <w:tcW w:type="dxa" w:w="4320"/>
+          </w:tcPr>
+          <w:p>
+            <w:r>
+              <w:t>2.058</w:t>
+            </w:r>
+          </w:p>
+        </w:tc>
+      </w:tr>
+      <w:tr>
+        <w:tc>
+          <w:tcPr>
+            <w:tcW w:type="dxa" w:w="4320"/>
+          </w:tcPr>
+          <w:p>
+            <w:r>
+              <w:t>river_level</w:t>
+            </w:r>
+          </w:p>
+        </w:tc>
+        <w:tc>
+          <w:tcPr>
+            <w:tcW w:type="dxa" w:w="4320"/>
+          </w:tcPr>
+          <w:p>
+            <w:r>
+              <w:t>1.101</w:t>
+            </w:r>
+          </w:p>
+        </w:tc>
+      </w:tr>
+      <w:tr>
+        <w:tc>
+          <w:tcPr>
+            <w:tcW w:type="dxa" w:w="4320"/>
+          </w:tcPr>
+          <w:p>
+            <w:r>
+              <w:t>herd_size</w:t>
+            </w:r>
+          </w:p>
+        </w:tc>
+        <w:tc>
+          <w:tcPr>
+            <w:tcW w:type="dxa" w:w="4320"/>
+          </w:tcPr>
+          <w:p>
+            <w:r>
+              <w:t>1.003</w:t>
             </w:r>
           </w:p>
         </w:tc>
@@ -541,7 +607,7 @@
           </w:tcPr>
           <w:p>
             <w:r>
-              <w:t>1.765</w:t>
+              <w:t>0.969</w:t>
             </w:r>
           </w:p>
         </w:tc>
@@ -553,7 +619,7 @@
           </w:tcPr>
           <w:p>
             <w:r>
-              <w:t>ndvi_lag1</w:t>
+              <w:t>goat_price_lag3</w:t>
             </w:r>
           </w:p>
         </w:tc>
@@ -563,7 +629,7 @@
           </w:tcPr>
           <w:p>
             <w:r>
-              <w:t>1.716</w:t>
+              <w:t>0.915</w:t>
             </w:r>
           </w:p>
         </w:tc>
@@ -585,7 +651,7 @@
           </w:tcPr>
           <w:p>
             <w:r>
-              <w:t>1.216</w:t>
+              <w:t>0.883</w:t>
             </w:r>
           </w:p>
         </w:tc>
@@ -607,7 +673,7 @@
           </w:tcPr>
           <w:p>
             <w:r>
-              <w:t>0.847</w:t>
+              <w:t>0.772</w:t>
             </w:r>
           </w:p>
         </w:tc>
@@ -619,7 +685,7 @@
           </w:tcPr>
           <w:p>
             <w:r>
-              <w:t>river_level</w:t>
+              <w:t>water_price_lag5</w:t>
             </w:r>
           </w:p>
         </w:tc>
@@ -629,73 +695,7 @@
           </w:tcPr>
           <w:p>
             <w:r>
-              <w:t>0.806</w:t>
-            </w:r>
-          </w:p>
-        </w:tc>
-      </w:tr>
-      <w:tr>
-        <w:tc>
-          <w:tcPr>
-            <w:tcW w:type="dxa" w:w="4320"/>
-          </w:tcPr>
-          <w:p>
-            <w:r>
-              <w:t>herd_size</w:t>
-            </w:r>
-          </w:p>
-        </w:tc>
-        <w:tc>
-          <w:tcPr>
-            <w:tcW w:type="dxa" w:w="4320"/>
-          </w:tcPr>
-          <w:p>
-            <w:r>
-              <w:t>0.641</w:t>
-            </w:r>
-          </w:p>
-        </w:tc>
-      </w:tr>
-      <w:tr>
-        <w:tc>
-          <w:tcPr>
-            <w:tcW w:type="dxa" w:w="4320"/>
-          </w:tcPr>
-          <w:p>
-            <w:r>
-              <w:t>year</w:t>
-            </w:r>
-          </w:p>
-        </w:tc>
-        <w:tc>
-          <w:tcPr>
-            <w:tcW w:type="dxa" w:w="4320"/>
-          </w:tcPr>
-          <w:p>
-            <w:r>
-              <w:t>0.602</w:t>
-            </w:r>
-          </w:p>
-        </w:tc>
-      </w:tr>
-      <w:tr>
-        <w:tc>
-          <w:tcPr>
-            <w:tcW w:type="dxa" w:w="4320"/>
-          </w:tcPr>
-          <w:p>
-            <w:r>
-              <w:t>goat_price_lag1</w:t>
-            </w:r>
-          </w:p>
-        </w:tc>
-        <w:tc>
-          <w:tcPr>
-            <w:tcW w:type="dxa" w:w="4320"/>
-          </w:tcPr>
-          <w:p>
-            <w:r>
-              <w:t>0.599</w:t>
+              <w:t>0.702</w:t>
             </w:r>
           </w:p>
         </w:tc>
@@ -717,7 +717,7 @@
           </w:tcPr>
           <w:p>
             <w:r>
-              <w:t>0.565</w:t>
+              <w:t>0.687</w:t>
             </w:r>
           </w:p>
         </w:tc>
@@ -862,7 +862,7 @@
     </w:p>
     <w:p>
       <w:r>
-        <w:t>Report Generated: 29 June 2026 17:35</w:t>
+        <w:t>Report Generated: 07 July 2026 22:39</w:t>
       </w:r>
     </w:p>
     <w:p>

</xml_diff>